<commit_message>
Align displayed equations with Arevalo, Zadeh, and the public code.
GMU is Arevalo's z-mix; the table gate is the score-space rule that is
run; unused positional embedding removed; CIs stated as 1.96 se.
</commit_message>
<xml_diff>
--- a/paper/vesta.docx
+++ b/paper/vesta.docx
@@ -863,13 +863,25 @@
         <w:t xml:space="preserve"> </w:t>
       </w:r>
       <w:r>
+        <w:t xml:space="preserve">class</w:t>
+      </w:r>
+      <w:r>
+        <w:t xml:space="preserve"> </w:t>
+      </w:r>
+      <w:r>
+        <w:t xml:space="preserve">scores</w:t>
+      </w:r>
+      <w:r>
+        <w:t xml:space="preserve"> </w:t>
+      </w:r>
+      <w:r>
         <w:t xml:space="preserve">are</w:t>
       </w:r>
       <w:r>
         <w:t xml:space="preserve"> </w:t>
       </w:r>
       <w:r>
-        <w:t xml:space="preserve">combined</w:t>
+        <w:t xml:space="preserve">mixed</w:t>
       </w:r>
       <w:r>
         <w:t xml:space="preserve"> </w:t>
@@ -881,25 +893,43 @@
         <w:t xml:space="preserve"> </w:t>
       </w:r>
       <w:r>
+        <w:t xml:space="preserve">GMU,</w:t>
+      </w:r>
+      <w:r>
+        <w:t xml:space="preserve"> </w:t>
+      </w:r>
+      <w:r>
+        <w:t xml:space="preserve">tensor</w:t>
+      </w:r>
+      <w:r>
+        <w:t xml:space="preserve"> </w:t>
+      </w:r>
+      <w:r>
+        <w:t xml:space="preserve">fusion,</w:t>
+      </w:r>
+      <w:r>
+        <w:t xml:space="preserve"> </w:t>
+      </w:r>
+      <w:r>
         <w:t xml:space="preserve">a</w:t>
       </w:r>
       <w:r>
         <w:t xml:space="preserve"> </w:t>
       </w:r>
       <w:r>
-        <w:t xml:space="preserve">standard</w:t>
-      </w:r>
-      <w:r>
-        <w:t xml:space="preserve"> </w:t>
-      </w:r>
-      <w:r>
-        <w:t xml:space="preserve">sigmoid</w:t>
-      </w:r>
-      <w:r>
-        <w:t xml:space="preserve"> </w:t>
-      </w:r>
-      <w:r>
-        <w:t xml:space="preserve">mixer</w:t>
+        <w:t xml:space="preserve">scalar</w:t>
+      </w:r>
+      <w:r>
+        <w:t xml:space="preserve"> </w:t>
+      </w:r>
+      <w:r>
+        <w:t xml:space="preserve">gate,</w:t>
+      </w:r>
+      <w:r>
+        <w:t xml:space="preserve"> </w:t>
+      </w:r>
+      <w:r>
+        <w:t xml:space="preserve">mean</w:t>
       </w:r>
       <w:r>
         <w:t xml:space="preserve"> </w:t>
@@ -911,37 +941,7 @@
         <w:t xml:space="preserve"> </w:t>
       </w:r>
       <w:r>
-        <w:t xml:space="preserve">compared</w:t>
-      </w:r>
-      <w:r>
-        <w:t xml:space="preserve"> </w:t>
-      </w:r>
-      <w:r>
-        <w:t xml:space="preserve">with</w:t>
-      </w:r>
-      <w:r>
-        <w:t xml:space="preserve"> </w:t>
-      </w:r>
-      <w:r>
-        <w:t xml:space="preserve">GMU</w:t>
-      </w:r>
-      <w:r>
-        <w:t xml:space="preserve"> </w:t>
-      </w:r>
-      <w:r>
-        <w:t xml:space="preserve">and</w:t>
-      </w:r>
-      <w:r>
-        <w:t xml:space="preserve"> </w:t>
-      </w:r>
-      <w:r>
-        <w:t xml:space="preserve">tensor</w:t>
-      </w:r>
-      <w:r>
-        <w:t xml:space="preserve"> </w:t>
-      </w:r>
-      <w:r>
-        <w:t xml:space="preserve">fusion.</w:t>
+        <w:t xml:space="preserve">concat.</w:t>
       </w:r>
       <w:r>
         <w:t xml:space="preserve"> </w:t>
@@ -1444,28 +1444,22 @@
         <w:t xml:space="preserve">(J. Jiang, Kelly, and Xiu 2023)</w:t>
       </w:r>
       <w:r>
-        <w:t xml:space="preserve">. The mixer is a standard sigmoid over concatenated features </w:t>
-      </w:r>
-      <w:r>
-        <w:t xml:space="preserve">(Arevalo et al. 2017; M. Jiang and Ji 2022)</w:t>
-      </w:r>
-      <w:r>
-        <w:t xml:space="preserve">; we compare it with GMU </w:t>
+        <w:t xml:space="preserve">. The public tables mix unimodal class scores with GMU </w:t>
       </w:r>
       <w:r>
         <w:t xml:space="preserve">(Arevalo et al. 2017)</w:t>
       </w:r>
       <w:r>
-        <w:t xml:space="preserve"> </w:t>
-      </w:r>
-      <w:r>
-        <w:t xml:space="preserve">and tensor fusion </w:t>
+        <w:t xml:space="preserve">, tensor fusion </w:t>
       </w:r>
       <w:r>
         <w:t xml:space="preserve">(Zadeh et al. 2017)</w:t>
       </w:r>
       <w:r>
-        <w:t xml:space="preserve">. Actionability is a long/short overlay against buy-and-hold, not classification F1 alone. The public chart is bars</w:t>
+        <w:t xml:space="preserve"> </w:t>
+      </w:r>
+      <w:r>
+        <w:t xml:space="preserve">and a scalar gate. Actionability is a long/short overlay against buy-and-hold, not classification F1 alone. The public chart is bars</w:t>
       </w:r>
       <w:r>
         <w:t xml:space="preserve"> </w:t>
@@ -1632,7 +1626,7 @@
         <w:t xml:space="preserve">(M. Jiang and Ji 2022)</w:t>
       </w:r>
       <w:r>
-        <w:t xml:space="preserve">. VESTA’s mixer is the bimodal special case of this family; we report GMU and TFN as external controls.</w:t>
+        <w:t xml:space="preserve">. Public tables mix unimodal class scores with GMU, TFN, a scalar gate, mean, concat and a MulT-style layer.</w:t>
       </w:r>
     </w:p>
     <w:p>
@@ -1894,7 +1888,7 @@
         </w:numPr>
       </w:pPr>
       <w:r>
-        <w:t xml:space="preserve">Score each document against the portfolio and the day’s gold / USD/TRY moves. A light sector-to-macro graph says which names are sensitive to those macros. Relevance of document</w:t>
+        <w:t xml:space="preserve">Score each document</w:t>
       </w:r>
       <w:r>
         <w:t xml:space="preserve"> </w:t>
@@ -1917,7 +1911,21 @@
         <w:t xml:space="preserve"> </w:t>
       </w:r>
       <w:r>
-        <w:t xml:space="preserve">is</w:t>
+        <w:t xml:space="preserve">by cosine to</w:t>
+      </w:r>
+      <w:r>
+        <w:t xml:space="preserve"> </w:t>
+      </w:r>
+      <m:oMath>
+        <m:r>
+          <m:t>P</m:t>
+        </m:r>
+      </m:oMath>
+      <w:r>
+        <w:t xml:space="preserve"> </w:t>
+      </w:r>
+      <w:r>
+        <w:t xml:space="preserve">plus the day’s gold, USD/TRY and session moves,</w:t>
       </w:r>
     </w:p>
     <w:p>
@@ -2038,77 +2046,27 @@
                 </m:rPr>
                 <m:t>+</m:t>
               </m:r>
-              <m:nary>
-                <m:naryPr>
-                  <m:chr m:val="∑"/>
-                  <m:limLoc m:val="undOvr"/>
-                  <m:subHide m:val="off"/>
-                  <m:supHide m:val="on"/>
-                </m:naryPr>
+              <m:sSub>
+                <m:e>
+                  <m:r>
+                    <m:t>β</m:t>
+                  </m:r>
+                </m:e>
                 <m:sub>
                   <m:r>
-                    <m:t>j</m:t>
+                    <m:rPr>
+                      <m:sty m:val="p"/>
+                    </m:rPr>
+                    <m:t>A</m:t>
                   </m:r>
                   <m:r>
                     <m:rPr>
                       <m:sty m:val="p"/>
                     </m:rPr>
-                    <m:t>∈</m:t>
-                  </m:r>
-                  <m:r>
-                    <m:rPr>
-                      <m:sty m:val="p"/>
-                    </m:rPr>
-                    <m:t>{</m:t>
-                  </m:r>
-                  <m:r>
-                    <m:t>G</m:t>
-                  </m:r>
-                  <m:r>
-                    <m:rPr>
-                      <m:sty m:val="p"/>
-                    </m:rPr>
-                    <m:t>,</m:t>
-                  </m:r>
-                  <m:r>
-                    <m:t>X</m:t>
-                  </m:r>
-                  <m:r>
-                    <m:rPr>
-                      <m:sty m:val="p"/>
-                    </m:rPr>
-                    <m:t>,</m:t>
-                  </m:r>
-                  <m:r>
-                    <m:t>T</m:t>
-                  </m:r>
-                  <m:r>
-                    <m:rPr>
-                      <m:sty m:val="p"/>
-                    </m:rPr>
-                    <m:t>}</m:t>
+                    <m:t>u</m:t>
                   </m:r>
                 </m:sub>
-                <m:sup>
-                  <m:r>
-                    <m:t>​</m:t>
-                  </m:r>
-                </m:sup>
-                <m:e>
-                  <m:sSub>
-                    <m:e>
-                      <m:r>
-                        <m:t>β</m:t>
-                      </m:r>
-                    </m:e>
-                    <m:sub>
-                      <m:r>
-                        <m:t>j</m:t>
-                      </m:r>
-                    </m:sub>
-                  </m:sSub>
-                </m:e>
-              </m:nary>
+              </m:sSub>
               <m:sSub>
                 <m:e>
                   <m:r>
@@ -2117,7 +2075,94 @@
                 </m:e>
                 <m:sub>
                   <m:r>
-                    <m:t>j</m:t>
+                    <m:rPr>
+                      <m:sty m:val="p"/>
+                    </m:rPr>
+                    <m:t>A</m:t>
+                  </m:r>
+                  <m:r>
+                    <m:rPr>
+                      <m:sty m:val="p"/>
+                    </m:rPr>
+                    <m:t>u</m:t>
+                  </m:r>
+                </m:sub>
+              </m:sSub>
+              <m:r>
+                <m:rPr>
+                  <m:sty m:val="p"/>
+                </m:rPr>
+                <m:t>+</m:t>
+              </m:r>
+              <m:sSub>
+                <m:e>
+                  <m:r>
+                    <m:t>β</m:t>
+                  </m:r>
+                </m:e>
+                <m:sub>
+                  <m:r>
+                    <m:rPr>
+                      <m:sty m:val="p"/>
+                    </m:rPr>
+                    <m:t>F</m:t>
+                  </m:r>
+                  <m:r>
+                    <m:rPr>
+                      <m:sty m:val="p"/>
+                    </m:rPr>
+                    <m:t>X</m:t>
+                  </m:r>
+                </m:sub>
+              </m:sSub>
+              <m:sSub>
+                <m:e>
+                  <m:r>
+                    <m:t>Δ</m:t>
+                  </m:r>
+                </m:e>
+                <m:sub>
+                  <m:r>
+                    <m:rPr>
+                      <m:sty m:val="p"/>
+                    </m:rPr>
+                    <m:t>F</m:t>
+                  </m:r>
+                  <m:r>
+                    <m:rPr>
+                      <m:sty m:val="p"/>
+                    </m:rPr>
+                    <m:t>X</m:t>
+                  </m:r>
+                </m:sub>
+              </m:sSub>
+              <m:r>
+                <m:rPr>
+                  <m:sty m:val="p"/>
+                </m:rPr>
+                <m:t>+</m:t>
+              </m:r>
+              <m:sSub>
+                <m:e>
+                  <m:r>
+                    <m:t>β</m:t>
+                  </m:r>
+                </m:e>
+                <m:sub>
+                  <m:r>
+                    <m:t>r</m:t>
+                  </m:r>
+                </m:sub>
+              </m:sSub>
+              <m:sSub>
+                <m:e>
+                  <m:r>
+                    <m:t>r</m:t>
+                  </m:r>
+                </m:e>
+                <m:sub>
+                  <m:r>
+                    <m:t>t</m:t>
                   </m:r>
                 </m:sub>
               </m:sSub>
@@ -2140,7 +2185,21 @@
         </w:numPr>
       </w:pPr>
       <w:r>
-        <w:t xml:space="preserve">where</w:t>
+        <w:t xml:space="preserve">with</w:t>
+      </w:r>
+      <w:r>
+        <w:t xml:space="preserve"> </w:t>
+      </w:r>
+      <m:oMath>
+        <m:r>
+          <m:t>σ</m:t>
+        </m:r>
+      </m:oMath>
+      <w:r>
+        <w:t xml:space="preserve"> </w:t>
+      </w:r>
+      <w:r>
+        <w:t xml:space="preserve">the logistic function and</w:t>
       </w:r>
       <w:r>
         <w:t xml:space="preserve"> </w:t>
@@ -2154,44 +2213,133 @@
           </m:e>
           <m:sub>
             <m:r>
-              <m:t>j</m:t>
+              <m:rPr>
+                <m:sty m:val="p"/>
+              </m:rPr>
+              <m:t>A</m:t>
+            </m:r>
+            <m:r>
+              <m:rPr>
+                <m:sty m:val="p"/>
+              </m:rPr>
+              <m:t>u</m:t>
             </m:r>
           </m:sub>
         </m:sSub>
       </m:oMath>
       <w:r>
-        <w:t xml:space="preserve"> </w:t>
-      </w:r>
-      <w:r>
-        <w:t xml:space="preserve">is the percentage change of macro-indicator</w:t>
+        <w:t xml:space="preserve">,</w:t>
       </w:r>
       <w:r>
         <w:t xml:space="preserve"> </w:t>
       </w:r>
       <m:oMath>
-        <m:r>
-          <m:t>j</m:t>
-        </m:r>
+        <m:sSub>
+          <m:e>
+            <m:r>
+              <m:t>Δ</m:t>
+            </m:r>
+          </m:e>
+          <m:sub>
+            <m:r>
+              <m:rPr>
+                <m:sty m:val="p"/>
+              </m:rPr>
+              <m:t>F</m:t>
+            </m:r>
+            <m:r>
+              <m:rPr>
+                <m:sty m:val="p"/>
+              </m:rPr>
+              <m:t>X</m:t>
+            </m:r>
+          </m:sub>
+        </m:sSub>
       </m:oMath>
       <w:r>
-        <w:t xml:space="preserve"> </w:t>
-      </w:r>
-      <w:r>
-        <w:t xml:space="preserve">and</w:t>
+        <w:t xml:space="preserve">,</w:t>
       </w:r>
       <w:r>
         <w:t xml:space="preserve"> </w:t>
       </w:r>
       <m:oMath>
-        <m:r>
-          <m:t>σ</m:t>
-        </m:r>
+        <m:sSub>
+          <m:e>
+            <m:r>
+              <m:t>r</m:t>
+            </m:r>
+          </m:e>
+          <m:sub>
+            <m:r>
+              <m:t>t</m:t>
+            </m:r>
+          </m:sub>
+        </m:sSub>
       </m:oMath>
       <w:r>
         <w:t xml:space="preserve"> </w:t>
       </w:r>
       <w:r>
-        <w:t xml:space="preserve">is the logistic function.</w:t>
+        <w:t xml:space="preserve">the gold, USD/TRY and session simple returns. Cosine on M3 vectors is dense retrieval </w:t>
+      </w:r>
+      <w:r>
+        <w:t xml:space="preserve">(Chen et al. 2024)</w:t>
+      </w:r>
+      <w:r>
+        <w:t xml:space="preserve">; Eq. </w:t>
+      </w:r>
+      <w:hyperlink w:anchor="eq:rel">
+        <w:r>
+          <w:rPr>
+            <w:rStyle w:val="Hyperlink"/>
+          </w:rPr>
+          <w:t xml:space="preserve">[eq:rel]</w:t>
+        </w:r>
+      </w:hyperlink>
+      <w:r>
+        <w:t xml:space="preserve"> </w:t>
+      </w:r>
+      <w:r>
+        <w:t xml:space="preserve">is our score, not the RAG generative likelihood. Public mixers use the 16-d macro+KAP bag;</w:t>
+      </w:r>
+      <w:r>
+        <w:t xml:space="preserve"> </w:t>
+      </w:r>
+      <m:oMath>
+        <m:r>
+          <m:t>α</m:t>
+        </m:r>
+      </m:oMath>
+      <w:r>
+        <w:t xml:space="preserve"> </w:t>
+      </w:r>
+      <w:r>
+        <w:t xml:space="preserve">and the</w:t>
+      </w:r>
+      <w:r>
+        <w:t xml:space="preserve"> </w:t>
+      </w:r>
+      <m:oMath>
+        <m:r>
+          <m:t>β</m:t>
+        </m:r>
+      </m:oMath>
+      <w:r>
+        <w:t xml:space="preserve"> </w:t>
+      </w:r>
+      <w:r>
+        <w:t xml:space="preserve">coefficients are not fitted in Table </w:t>
+      </w:r>
+      <w:hyperlink w:anchor="tab:fwd">
+        <w:r>
+          <w:rPr>
+            <w:rStyle w:val="Hyperlink"/>
+          </w:rPr>
+          <w:t xml:space="preserve">4</w:t>
+        </w:r>
+      </w:hyperlink>
+      <w:r>
+        <w:t xml:space="preserve">.</w:t>
       </w:r>
     </w:p>
     <w:p>
@@ -3080,187 +3228,7 @@
         <w:t xml:space="preserve">(J. Jiang, Kelly, and Xiu 2023)</w:t>
       </w:r>
       <w:r>
-        <w:t xml:space="preserve">. A recency-weighted patch position</w:t>
-      </w:r>
-    </w:p>
-    <w:p>
-      <w:pPr>
-        <w:pStyle w:val="BodyText"/>
-      </w:pPr>
-      <m:oMathPara>
-        <m:oMathParaPr>
-          <m:jc m:val="center"/>
-        </m:oMathParaPr>
-        <m:oMath>
-          <m:sSub>
-            <m:e>
-              <m:r>
-                <m:t>E</m:t>
-              </m:r>
-            </m:e>
-            <m:sub>
-              <m:r>
-                <m:rPr>
-                  <m:sty m:val="p"/>
-                </m:rPr>
-                <m:t>t</m:t>
-              </m:r>
-              <m:r>
-                <m:rPr>
-                  <m:sty m:val="p"/>
-                </m:rPr>
-                <m:t>o</m:t>
-              </m:r>
-              <m:r>
-                <m:rPr>
-                  <m:sty m:val="p"/>
-                </m:rPr>
-                <m:t>t</m:t>
-              </m:r>
-              <m:r>
-                <m:rPr>
-                  <m:sty m:val="p"/>
-                </m:rPr>
-                <m:t>a</m:t>
-              </m:r>
-              <m:r>
-                <m:rPr>
-                  <m:sty m:val="p"/>
-                </m:rPr>
-                <m:t>l</m:t>
-              </m:r>
-            </m:sub>
-          </m:sSub>
-          <m:r>
-            <m:rPr>
-              <m:sty m:val="p"/>
-            </m:rPr>
-            <m:t>=</m:t>
-          </m:r>
-          <m:sSub>
-            <m:e>
-              <m:r>
-                <m:t>E</m:t>
-              </m:r>
-            </m:e>
-            <m:sub>
-              <m:r>
-                <m:rPr>
-                  <m:sty m:val="p"/>
-                </m:rPr>
-                <m:t>p</m:t>
-              </m:r>
-              <m:r>
-                <m:rPr>
-                  <m:sty m:val="p"/>
-                </m:rPr>
-                <m:t>a</m:t>
-              </m:r>
-              <m:r>
-                <m:rPr>
-                  <m:sty m:val="p"/>
-                </m:rPr>
-                <m:t>t</m:t>
-              </m:r>
-              <m:r>
-                <m:rPr>
-                  <m:sty m:val="p"/>
-                </m:rPr>
-                <m:t>c</m:t>
-              </m:r>
-              <m:r>
-                <m:rPr>
-                  <m:sty m:val="p"/>
-                </m:rPr>
-                <m:t>h</m:t>
-              </m:r>
-            </m:sub>
-          </m:sSub>
-          <m:r>
-            <m:rPr>
-              <m:sty m:val="p"/>
-            </m:rPr>
-            <m:t>+</m:t>
-          </m:r>
-          <m:sSub>
-            <m:e>
-              <m:r>
-                <m:t>E</m:t>
-              </m:r>
-            </m:e>
-            <m:sub>
-              <m:r>
-                <m:rPr>
-                  <m:sty m:val="p"/>
-                </m:rPr>
-                <m:t>p</m:t>
-              </m:r>
-              <m:r>
-                <m:rPr>
-                  <m:sty m:val="p"/>
-                </m:rPr>
-                <m:t>o</m:t>
-              </m:r>
-              <m:r>
-                <m:rPr>
-                  <m:sty m:val="p"/>
-                </m:rPr>
-                <m:t>s</m:t>
-              </m:r>
-            </m:sub>
-          </m:sSub>
-          <m:r>
-            <m:rPr>
-              <m:sty m:val="p"/>
-            </m:rPr>
-            <m:t>⋅</m:t>
-          </m:r>
-          <m:d>
-            <m:dPr>
-              <m:begChr m:val="("/>
-              <m:endChr m:val=")"/>
-              <m:sepChr m:val=""/>
-              <m:grow/>
-            </m:dPr>
-            <m:e>
-              <m:r>
-                <m:t>1</m:t>
-              </m:r>
-              <m:r>
-                <m:rPr>
-                  <m:sty m:val="p"/>
-                </m:rPr>
-                <m:t>+</m:t>
-              </m:r>
-              <m:r>
-                <m:t>λ</m:t>
-              </m:r>
-              <m:r>
-                <m:t> </m:t>
-              </m:r>
-              <m:r>
-                <m:t>t</m:t>
-              </m:r>
-              <m:r>
-                <m:rPr>
-                  <m:sty m:val="p"/>
-                </m:rPr>
-                <m:t>/</m:t>
-              </m:r>
-              <m:r>
-                <m:t>T</m:t>
-              </m:r>
-            </m:e>
-          </m:d>
-        </m:oMath>
-      </m:oMathPara>
-    </w:p>
-    <w:p>
-      <w:pPr>
-        <w:pStyle w:val="FirstParagraph"/>
-      </w:pPr>
-      <w:r>
-        <w:t xml:space="preserve">is unused in the public tables, which train the</w:t>
+        <w:t xml:space="preserve">. Public tables train the flattened</w:t>
       </w:r>
       <w:r>
         <w:t xml:space="preserve"> </w:t>
@@ -3283,7 +3251,7 @@
         <w:t xml:space="preserve"> </w:t>
       </w:r>
       <w:r>
-        <w:t xml:space="preserve">MLP instead.</w:t>
+        <w:t xml:space="preserve">MLP; they do not add a recency term to patch positions.</w:t>
       </w:r>
     </w:p>
     <w:p>
@@ -3399,13 +3367,462 @@
         <w:pStyle w:val="FirstParagraph"/>
       </w:pPr>
       <w:r>
-        <w:t xml:space="preserve">The two streams are fused on every run with a standard mixer </w:t>
-      </w:r>
-      <w:r>
-        <w:t xml:space="preserve">(Arevalo et al. 2017; M. Jiang and Ji 2022)</w:t>
-      </w:r>
-      <w:r>
-        <w:t xml:space="preserve">. Let</w:t>
+        <w:t xml:space="preserve">Arevalo et al. write the bimodal GMU as </w:t>
+      </w:r>
+      <w:r>
+        <w:t xml:space="preserve">(Arevalo et al. 2017)</w:t>
+      </w:r>
+    </w:p>
+    <w:p>
+      <w:pPr>
+        <w:pStyle w:val="BodyText"/>
+      </w:pPr>
+      <m:oMathPara>
+        <m:oMathParaPr>
+          <m:jc m:val="center"/>
+        </m:oMathParaPr>
+        <m:oMath>
+          <m:m>
+            <m:mPr>
+              <m:baseJc m:val="center"/>
+              <m:plcHide m:val="on"/>
+              <m:mcs>
+                <m:mc>
+                  <m:mcPr>
+                    <m:mcJc m:val="right"/>
+                    <m:count m:val="1"/>
+                  </m:mcPr>
+                </m:mc>
+                <m:mc>
+                  <m:mcPr>
+                    <m:mcJc m:val="left"/>
+                    <m:count m:val="1"/>
+                  </m:mcPr>
+                </m:mc>
+              </m:mcs>
+            </m:mPr>
+            <m:mr>
+              <m:e>
+                <m:sSub>
+                  <m:e>
+                    <m:r>
+                      <m:t>h</m:t>
+                    </m:r>
+                  </m:e>
+                  <m:sub>
+                    <m:r>
+                      <m:t>v</m:t>
+                    </m:r>
+                  </m:sub>
+                </m:sSub>
+              </m:e>
+              <m:e>
+                <m:r>
+                  <m:rPr>
+                    <m:sty m:val="p"/>
+                  </m:rPr>
+                  <m:t>=</m:t>
+                </m:r>
+                <m:r>
+                  <m:rPr>
+                    <m:sty m:val="p"/>
+                  </m:rPr>
+                  <m:t>tanh</m:t>
+                </m:r>
+                <m:d>
+                  <m:dPr>
+                    <m:begChr m:val="("/>
+                    <m:endChr m:val=")"/>
+                    <m:sepChr m:val=""/>
+                    <m:grow/>
+                  </m:dPr>
+                  <m:e>
+                    <m:sSub>
+                      <m:e>
+                        <m:r>
+                          <m:t>W</m:t>
+                        </m:r>
+                      </m:e>
+                      <m:sub>
+                        <m:r>
+                          <m:t>v</m:t>
+                        </m:r>
+                      </m:sub>
+                    </m:sSub>
+                    <m:sSub>
+                      <m:e>
+                        <m:r>
+                          <m:t>x</m:t>
+                        </m:r>
+                      </m:e>
+                      <m:sub>
+                        <m:r>
+                          <m:t>v</m:t>
+                        </m:r>
+                      </m:sub>
+                    </m:sSub>
+                  </m:e>
+                </m:d>
+                <m:r>
+                  <m:rPr>
+                    <m:sty m:val="p"/>
+                  </m:rPr>
+                  <m:t>,</m:t>
+                </m:r>
+                <m:r>
+                  <m:t>  </m:t>
+                </m:r>
+                <m:sSub>
+                  <m:e>
+                    <m:r>
+                      <m:t>h</m:t>
+                    </m:r>
+                  </m:e>
+                  <m:sub>
+                    <m:r>
+                      <m:t>t</m:t>
+                    </m:r>
+                  </m:sub>
+                </m:sSub>
+                <m:r>
+                  <m:rPr>
+                    <m:sty m:val="p"/>
+                  </m:rPr>
+                  <m:t>=</m:t>
+                </m:r>
+                <m:r>
+                  <m:rPr>
+                    <m:sty m:val="p"/>
+                  </m:rPr>
+                  <m:t>tanh</m:t>
+                </m:r>
+                <m:d>
+                  <m:dPr>
+                    <m:begChr m:val="("/>
+                    <m:endChr m:val=")"/>
+                    <m:sepChr m:val=""/>
+                    <m:grow/>
+                  </m:dPr>
+                  <m:e>
+                    <m:sSub>
+                      <m:e>
+                        <m:r>
+                          <m:t>W</m:t>
+                        </m:r>
+                      </m:e>
+                      <m:sub>
+                        <m:r>
+                          <m:t>t</m:t>
+                        </m:r>
+                      </m:sub>
+                    </m:sSub>
+                    <m:sSub>
+                      <m:e>
+                        <m:r>
+                          <m:t>x</m:t>
+                        </m:r>
+                      </m:e>
+                      <m:sub>
+                        <m:r>
+                          <m:t>t</m:t>
+                        </m:r>
+                      </m:sub>
+                    </m:sSub>
+                  </m:e>
+                </m:d>
+                <m:r>
+                  <m:rPr>
+                    <m:sty m:val="p"/>
+                  </m:rPr>
+                  <m:t>,</m:t>
+                </m:r>
+              </m:e>
+            </m:mr>
+            <m:mr>
+              <m:e>
+                <m:r>
+                  <m:t>z</m:t>
+                </m:r>
+              </m:e>
+              <m:e>
+                <m:r>
+                  <m:rPr>
+                    <m:sty m:val="p"/>
+                  </m:rPr>
+                  <m:t>=</m:t>
+                </m:r>
+                <m:r>
+                  <m:t>σ</m:t>
+                </m:r>
+                <m:d>
+                  <m:dPr>
+                    <m:begChr m:val="("/>
+                    <m:endChr m:val=")"/>
+                    <m:sepChr m:val=""/>
+                    <m:grow/>
+                  </m:dPr>
+                  <m:e>
+                    <m:sSub>
+                      <m:e>
+                        <m:r>
+                          <m:t>W</m:t>
+                        </m:r>
+                      </m:e>
+                      <m:sub>
+                        <m:r>
+                          <m:t>z</m:t>
+                        </m:r>
+                      </m:sub>
+                    </m:sSub>
+                    <m:d>
+                      <m:dPr>
+                        <m:begChr m:val="["/>
+                        <m:endChr m:val="]"/>
+                        <m:sepChr m:val=""/>
+                        <m:grow/>
+                      </m:dPr>
+                      <m:e>
+                        <m:sSub>
+                          <m:e>
+                            <m:r>
+                              <m:t>x</m:t>
+                            </m:r>
+                          </m:e>
+                          <m:sub>
+                            <m:r>
+                              <m:t>v</m:t>
+                            </m:r>
+                          </m:sub>
+                        </m:sSub>
+                        <m:r>
+                          <m:rPr>
+                            <m:sty m:val="p"/>
+                          </m:rPr>
+                          <m:t>;</m:t>
+                        </m:r>
+                        <m:sSub>
+                          <m:e>
+                            <m:r>
+                              <m:t>x</m:t>
+                            </m:r>
+                          </m:e>
+                          <m:sub>
+                            <m:r>
+                              <m:t>t</m:t>
+                            </m:r>
+                          </m:sub>
+                        </m:sSub>
+                      </m:e>
+                    </m:d>
+                  </m:e>
+                </m:d>
+                <m:r>
+                  <m:rPr>
+                    <m:sty m:val="p"/>
+                  </m:rPr>
+                  <m:t>,</m:t>
+                </m:r>
+                <m:r>
+                  <m:t>  </m:t>
+                </m:r>
+                <m:r>
+                  <m:t>h</m:t>
+                </m:r>
+                <m:r>
+                  <m:rPr>
+                    <m:sty m:val="p"/>
+                  </m:rPr>
+                  <m:t>=</m:t>
+                </m:r>
+                <m:r>
+                  <m:t>z</m:t>
+                </m:r>
+                <m:r>
+                  <m:t> </m:t>
+                </m:r>
+                <m:sSub>
+                  <m:e>
+                    <m:r>
+                      <m:t>h</m:t>
+                    </m:r>
+                  </m:e>
+                  <m:sub>
+                    <m:r>
+                      <m:t>v</m:t>
+                    </m:r>
+                  </m:sub>
+                </m:sSub>
+                <m:r>
+                  <m:rPr>
+                    <m:sty m:val="p"/>
+                  </m:rPr>
+                  <m:t>+</m:t>
+                </m:r>
+                <m:d>
+                  <m:dPr>
+                    <m:begChr m:val="("/>
+                    <m:endChr m:val=")"/>
+                    <m:sepChr m:val=""/>
+                    <m:grow/>
+                  </m:dPr>
+                  <m:e>
+                    <m:r>
+                      <m:t>1</m:t>
+                    </m:r>
+                    <m:r>
+                      <m:rPr>
+                        <m:sty m:val="p"/>
+                      </m:rPr>
+                      <m:t>−</m:t>
+                    </m:r>
+                    <m:r>
+                      <m:t>z</m:t>
+                    </m:r>
+                  </m:e>
+                </m:d>
+                <m:r>
+                  <m:t> </m:t>
+                </m:r>
+                <m:sSub>
+                  <m:e>
+                    <m:r>
+                      <m:t>h</m:t>
+                    </m:r>
+                  </m:e>
+                  <m:sub>
+                    <m:r>
+                      <m:t>t</m:t>
+                    </m:r>
+                  </m:sub>
+                </m:sSub>
+                <m:r>
+                  <m:rPr>
+                    <m:sty m:val="p"/>
+                  </m:rPr>
+                  <m:t>,</m:t>
+                </m:r>
+              </m:e>
+            </m:mr>
+          </m:m>
+        </m:oMath>
+      </m:oMathPara>
+    </w:p>
+    <w:p>
+      <w:pPr>
+        <w:pStyle w:val="FirstParagraph"/>
+      </w:pPr>
+      <w:r>
+        <w:t xml:space="preserve">so</w:t>
+      </w:r>
+      <w:r>
+        <w:t xml:space="preserve"> </w:t>
+      </w:r>
+      <m:oMath>
+        <m:r>
+          <m:t>z</m:t>
+        </m:r>
+      </m:oMath>
+      <w:r>
+        <w:t xml:space="preserve"> </w:t>
+      </w:r>
+      <w:r>
+        <w:t xml:space="preserve">near 1 keeps the visual branch. Zadeh et al. flatten</w:t>
+      </w:r>
+      <w:r>
+        <w:t xml:space="preserve"> </w:t>
+      </w:r>
+      <m:oMath>
+        <m:d>
+          <m:dPr>
+            <m:begChr m:val="["/>
+            <m:endChr m:val="]"/>
+            <m:sepChr m:val=""/>
+            <m:grow/>
+          </m:dPr>
+          <m:e>
+            <m:sSub>
+              <m:e>
+                <m:r>
+                  <m:t>h</m:t>
+                </m:r>
+              </m:e>
+              <m:sub>
+                <m:r>
+                  <m:t>t</m:t>
+                </m:r>
+              </m:sub>
+            </m:sSub>
+            <m:r>
+              <m:rPr>
+                <m:sty m:val="p"/>
+              </m:rPr>
+              <m:t>;</m:t>
+            </m:r>
+            <m:r>
+              <m:t>1</m:t>
+            </m:r>
+          </m:e>
+        </m:d>
+        <m:r>
+          <m:rPr>
+            <m:sty m:val="p"/>
+          </m:rPr>
+          <m:t>⊗</m:t>
+        </m:r>
+        <m:d>
+          <m:dPr>
+            <m:begChr m:val="["/>
+            <m:endChr m:val="]"/>
+            <m:sepChr m:val=""/>
+            <m:grow/>
+          </m:dPr>
+          <m:e>
+            <m:sSub>
+              <m:e>
+                <m:r>
+                  <m:t>h</m:t>
+                </m:r>
+              </m:e>
+              <m:sub>
+                <m:r>
+                  <m:t>v</m:t>
+                </m:r>
+              </m:sub>
+            </m:sSub>
+            <m:r>
+              <m:rPr>
+                <m:sty m:val="p"/>
+              </m:rPr>
+              <m:t>;</m:t>
+            </m:r>
+            <m:r>
+              <m:t>1</m:t>
+            </m:r>
+          </m:e>
+        </m:d>
+      </m:oMath>
+      <w:r>
+        <w:t xml:space="preserve"> </w:t>
+      </w:r>
+      <w:r>
+        <w:t xml:space="preserve">(TFN) </w:t>
+      </w:r>
+      <w:r>
+        <w:t xml:space="preserve">(Zadeh et al. 2017)</w:t>
+      </w:r>
+      <w:r>
+        <w:t xml:space="preserve">. In Table </w:t>
+      </w:r>
+      <w:hyperlink w:anchor="tab:fwd">
+        <w:r>
+          <w:rPr>
+            <w:rStyle w:val="Hyperlink"/>
+          </w:rPr>
+          <w:t xml:space="preserve">4</w:t>
+        </w:r>
+      </w:hyperlink>
+      <w:r>
+        <w:t xml:space="preserve">,</w:t>
       </w:r>
       <w:r>
         <w:t xml:space="preserve"> </w:t>
@@ -3414,32 +3831,11 @@
         <m:sSub>
           <m:e>
             <m:r>
-              <m:t>H</m:t>
+              <m:t>x</m:t>
             </m:r>
           </m:e>
           <m:sub>
             <m:r>
-              <m:rPr>
-                <m:sty m:val="p"/>
-              </m:rPr>
-              <m:t>t</m:t>
-            </m:r>
-            <m:r>
-              <m:rPr>
-                <m:sty m:val="p"/>
-              </m:rPr>
-              <m:t>e</m:t>
-            </m:r>
-            <m:r>
-              <m:rPr>
-                <m:sty m:val="p"/>
-              </m:rPr>
-              <m:t>x</m:t>
-            </m:r>
-            <m:r>
-              <m:rPr>
-                <m:sty m:val="p"/>
-              </m:rPr>
               <m:t>t</m:t>
             </m:r>
           </m:sub>
@@ -3458,45 +3854,12 @@
         <m:sSub>
           <m:e>
             <m:r>
-              <m:t>H</m:t>
+              <m:t>x</m:t>
             </m:r>
           </m:e>
           <m:sub>
             <m:r>
-              <m:rPr>
-                <m:sty m:val="p"/>
-              </m:rPr>
               <m:t>v</m:t>
-            </m:r>
-            <m:r>
-              <m:rPr>
-                <m:sty m:val="p"/>
-              </m:rPr>
-              <m:t>i</m:t>
-            </m:r>
-            <m:r>
-              <m:rPr>
-                <m:sty m:val="p"/>
-              </m:rPr>
-              <m:t>s</m:t>
-            </m:r>
-            <m:r>
-              <m:rPr>
-                <m:sty m:val="p"/>
-              </m:rPr>
-              <m:t>i</m:t>
-            </m:r>
-            <m:r>
-              <m:rPr>
-                <m:sty m:val="p"/>
-              </m:rPr>
-              <m:t>o</m:t>
-            </m:r>
-            <m:r>
-              <m:rPr>
-                <m:sty m:val="p"/>
-              </m:rPr>
-              <m:t>n</m:t>
             </m:r>
           </m:sub>
         </m:sSub>
@@ -3505,7 +3868,87 @@
         <w:t xml:space="preserve"> </w:t>
       </w:r>
       <w:r>
-        <w:t xml:space="preserve">be the text and vision vectors. A scalar gate</w:t>
+        <w:t xml:space="preserve">are unimodal class-score vectors:</w:t>
+      </w:r>
+      <w:r>
+        <w:t xml:space="preserve"> </w:t>
+      </w:r>
+      <m:oMath>
+        <m:sSub>
+          <m:e>
+            <m:r>
+              <m:t>W</m:t>
+            </m:r>
+          </m:e>
+          <m:sub>
+            <m:r>
+              <m:t>v</m:t>
+            </m:r>
+          </m:sub>
+        </m:sSub>
+      </m:oMath>
+      <w:r>
+        <w:t xml:space="preserve">,</w:t>
+      </w:r>
+      <w:r>
+        <w:t xml:space="preserve"> </w:t>
+      </w:r>
+      <m:oMath>
+        <m:sSub>
+          <m:e>
+            <m:r>
+              <m:t>W</m:t>
+            </m:r>
+          </m:e>
+          <m:sub>
+            <m:r>
+              <m:t>t</m:t>
+            </m:r>
+          </m:sub>
+        </m:sSub>
+      </m:oMath>
+      <w:r>
+        <w:t xml:space="preserve"> </w:t>
+      </w:r>
+      <w:r>
+        <w:t xml:space="preserve">and</w:t>
+      </w:r>
+      <w:r>
+        <w:t xml:space="preserve"> </w:t>
+      </w:r>
+      <m:oMath>
+        <m:sSub>
+          <m:e>
+            <m:r>
+              <m:t>W</m:t>
+            </m:r>
+          </m:e>
+          <m:sub>
+            <m:r>
+              <m:t>z</m:t>
+            </m:r>
+          </m:sub>
+        </m:sSub>
+      </m:oMath>
+      <w:r>
+        <w:t xml:space="preserve"> </w:t>
+      </w:r>
+      <w:r>
+        <w:t xml:space="preserve">are unused. The GMU row keeps Arevalo’s mix with</w:t>
+      </w:r>
+      <w:r>
+        <w:t xml:space="preserve"> </w:t>
+      </w:r>
+      <m:oMath>
+        <m:r>
+          <m:t>z</m:t>
+        </m:r>
+      </m:oMath>
+      <w:r>
+        <w:t xml:space="preserve"> </w:t>
+      </w:r>
+      <w:r>
+        <w:t xml:space="preserve">a sigmoid of the score gap. The TFN row uses that outer product on the same scores. The scalar-gate row uses</w:t>
       </w:r>
     </w:p>
     <w:p>
@@ -3560,22 +4003,13 @@
                     <m:grow/>
                   </m:dPr>
                   <m:e>
-                    <m:sSub>
-                      <m:e>
-                        <m:r>
-                          <m:t>W</m:t>
-                        </m:r>
-                      </m:e>
-                      <m:sub>
-                        <m:r>
-                          <m:t>g</m:t>
-                        </m:r>
-                      </m:sub>
-                    </m:sSub>
+                    <m:r>
+                      <m:t>4</m:t>
+                    </m:r>
                     <m:d>
                       <m:dPr>
-                        <m:begChr m:val="["/>
-                        <m:endChr m:val="]"/>
+                        <m:begChr m:val="("/>
+                        <m:endChr m:val=")"/>
                         <m:sepChr m:val=""/>
                         <m:grow/>
                       </m:dPr>
@@ -3583,7 +4017,7 @@
                         <m:sSub>
                           <m:e>
                             <m:r>
-                              <m:t>H</m:t>
+                              <m:t>p</m:t>
                             </m:r>
                           </m:e>
                           <m:sub>
@@ -3617,12 +4051,12 @@
                           <m:rPr>
                             <m:sty m:val="p"/>
                           </m:rPr>
-                          <m:t>;</m:t>
+                          <m:t>−</m:t>
                         </m:r>
                         <m:sSub>
                           <m:e>
                             <m:r>
-                              <m:t>H</m:t>
+                              <m:t>p</m:t>
                             </m:r>
                           </m:e>
                           <m:sub>
@@ -3666,24 +4100,6 @@
                         </m:sSub>
                       </m:e>
                     </m:d>
-                    <m:r>
-                      <m:rPr>
-                        <m:sty m:val="p"/>
-                      </m:rPr>
-                      <m:t>+</m:t>
-                    </m:r>
-                    <m:sSub>
-                      <m:e>
-                        <m:r>
-                          <m:t>b</m:t>
-                        </m:r>
-                      </m:e>
-                      <m:sub>
-                        <m:r>
-                          <m:t>g</m:t>
-                        </m:r>
-                      </m:sub>
-                    </m:sSub>
                   </m:e>
                 </m:d>
                 <m:r>
@@ -3696,45 +4112,9 @@
             </m:mr>
             <m:mr>
               <m:e>
-                <m:sSub>
-                  <m:e>
-                    <m:r>
-                      <m:t>H</m:t>
-                    </m:r>
-                  </m:e>
-                  <m:sub>
-                    <m:r>
-                      <m:rPr>
-                        <m:sty m:val="p"/>
-                      </m:rPr>
-                      <m:t>f</m:t>
-                    </m:r>
-                    <m:r>
-                      <m:rPr>
-                        <m:sty m:val="p"/>
-                      </m:rPr>
-                      <m:t>u</m:t>
-                    </m:r>
-                    <m:r>
-                      <m:rPr>
-                        <m:sty m:val="p"/>
-                      </m:rPr>
-                      <m:t>s</m:t>
-                    </m:r>
-                    <m:r>
-                      <m:rPr>
-                        <m:sty m:val="p"/>
-                      </m:rPr>
-                      <m:t>e</m:t>
-                    </m:r>
-                    <m:r>
-                      <m:rPr>
-                        <m:sty m:val="p"/>
-                      </m:rPr>
-                      <m:t>d</m:t>
-                    </m:r>
-                  </m:sub>
-                </m:sSub>
+                <m:r>
+                  <m:t>h</m:t>
+                </m:r>
               </m:e>
               <m:e>
                 <m:r>
@@ -3747,10 +4127,7 @@
                   <m:t>g</m:t>
                 </m:r>
                 <m:r>
-                  <m:rPr>
-                    <m:sty m:val="p"/>
-                  </m:rPr>
-                  <m:t>⋅</m:t>
+                  <m:t> </m:t>
                 </m:r>
                 <m:r>
                   <m:rPr>
@@ -3769,7 +4146,7 @@
                     <m:sSub>
                       <m:e>
                         <m:r>
-                          <m:t>H</m:t>
+                          <m:t>p</m:t>
                         </m:r>
                       </m:e>
                       <m:sub>
@@ -3830,10 +4207,7 @@
                   </m:e>
                 </m:d>
                 <m:r>
-                  <m:rPr>
-                    <m:sty m:val="p"/>
-                  </m:rPr>
-                  <m:t>⋅</m:t>
+                  <m:t> </m:t>
                 </m:r>
                 <m:r>
                   <m:rPr>
@@ -3852,7 +4226,7 @@
                     <m:sSub>
                       <m:e>
                         <m:r>
-                          <m:t>H</m:t>
+                          <m:t>p</m:t>
                         </m:r>
                       </m:e>
                       <m:sub>
@@ -3900,7 +4274,7 @@
                   <m:rPr>
                     <m:sty m:val="p"/>
                   </m:rPr>
-                  <m:t>.</m:t>
+                  <m:t>,</m:t>
                 </m:r>
               </m:e>
             </m:mr>
@@ -3913,7 +4287,7 @@
         <w:pStyle w:val="FirstParagraph"/>
       </w:pPr>
       <w:r>
-        <w:t xml:space="preserve">weights the two streams:</w:t>
+        <w:t xml:space="preserve">so</w:t>
       </w:r>
       <w:r>
         <w:t xml:space="preserve"> </w:t>
@@ -3927,44 +4301,36 @@
         <w:t xml:space="preserve"> </w:t>
       </w:r>
       <w:r>
-        <w:t xml:space="preserve">close to 1 trusts text,</w:t>
+        <w:t xml:space="preserve">near 1 keeps text. A small MLP reads the mix. Mean and concat are unweighted. The MulT-style row is one CPU attention layer on two text tokens and nine</w:t>
       </w:r>
       <w:r>
         <w:t xml:space="preserve"> </w:t>
       </w:r>
       <m:oMath>
         <m:r>
-          <m:t>g</m:t>
+          <m:t>8</m:t>
+        </m:r>
+        <m:r>
+          <m:rPr>
+            <m:sty m:val="p"/>
+          </m:rPr>
+          <m:t>×</m:t>
+        </m:r>
+        <m:r>
+          <m:t>8</m:t>
         </m:r>
       </m:oMath>
       <w:r>
         <w:t xml:space="preserve"> </w:t>
       </w:r>
       <w:r>
-        <w:t xml:space="preserve">close to 0 trusts the chart.</w:t>
-      </w:r>
-      <w:r>
-        <w:t xml:space="preserve"> </w:t>
-      </w:r>
-      <m:oMath>
-        <m:sSub>
-          <m:e>
-            <m:r>
-              <m:t>W</m:t>
-            </m:r>
-          </m:e>
-          <m:sub>
-            <m:r>
-              <m:t>g</m:t>
-            </m:r>
-          </m:sub>
-        </m:sSub>
-      </m:oMath>
-      <w:r>
-        <w:t xml:space="preserve"> </w:t>
-      </w:r>
-      <w:r>
-        <w:t xml:space="preserve">can be learned. In the public tables we instead mix the two class scores with this gate, with GMU, with tensor fusion, or with a mean, then pass the mix to a small MLP. The same fused score later drives T1 / T3 / T10. All mixers are reported side by side.</w:t>
+        <w:t xml:space="preserve">patches, with frozen projections </w:t>
+      </w:r>
+      <w:r>
+        <w:t xml:space="preserve">(Tsai et al. 2019)</w:t>
+      </w:r>
+      <w:r>
+        <w:t xml:space="preserve">. The fused call drives T1 / T3 / T10.</w:t>
       </w:r>
     </w:p>
     <w:bookmarkEnd w:id="38"/>
@@ -4118,6 +4484,29 @@
         </m:r>
       </m:oMath>
       <w:r>
+        <w:t xml:space="preserve"> </w:t>
+      </w:r>
+      <w:r>
+        <w:t xml:space="preserve">with</w:t>
+      </w:r>
+      <w:r>
+        <w:t xml:space="preserve"> </w:t>
+      </w:r>
+      <m:oMath>
+        <m:r>
+          <m:t>τ</m:t>
+        </m:r>
+        <m:r>
+          <m:rPr>
+            <m:sty m:val="p"/>
+          </m:rPr>
+          <m:t>=</m:t>
+        </m:r>
+        <m:r>
+          <m:t>0.18</m:t>
+        </m:r>
+      </m:oMath>
+      <w:r>
         <w:t xml:space="preserve">; otherwise abstain. Target latency</w:t>
       </w:r>
       <w:r>
@@ -4235,18 +4624,26 @@
         <w:t xml:space="preserve"> </w:t>
       </w:r>
       <w:r>
-        <w:t xml:space="preserve">realized-vol flag is 20-day vol above the mean</w:t>
+        <w:t xml:space="preserve">realized-vol flag at day</w:t>
       </w:r>
       <w:r>
         <w:t xml:space="preserve"> </w:t>
       </w:r>
       <m:oMath>
         <m:r>
-          <m:rPr>
-            <m:sty m:val="p"/>
-          </m:rPr>
-          <m:t>+</m:t>
-        </m:r>
+          <m:t>t</m:t>
+        </m:r>
+      </m:oMath>
+      <w:r>
+        <w:t xml:space="preserve"> </w:t>
+      </w:r>
+      <w:r>
+        <w:t xml:space="preserve">is 20-day realized vol (annualized) above the 60-day rolling mean plus</w:t>
+      </w:r>
+      <w:r>
+        <w:t xml:space="preserve"> </w:t>
+      </w:r>
+      <m:oMath>
         <m:r>
           <m:t>2</m:t>
         </m:r>
@@ -4258,7 +4655,7 @@
         <w:t xml:space="preserve"> </w:t>
       </w:r>
       <w:r>
-        <w:t xml:space="preserve">of the previous 60 vol observations. It is a closed-form function of the tabular vector at</w:t>
+        <w:t xml:space="preserve">of that 20-day vol series, all taken from the tabular vector at</w:t>
       </w:r>
       <w:r>
         <w:t xml:space="preserve"> </w:t>
@@ -4453,18 +4850,32 @@
         <w:pStyle w:val="FirstParagraph"/>
       </w:pPr>
       <w:r>
-        <w:t xml:space="preserve">Classification. Accuracy and macro-F1, 95%</w:t>
+        <w:t xml:space="preserve">Classification. Accuracy and macro-F1, mean</w:t>
       </w:r>
       <w:r>
         <w:t xml:space="preserve"> </w:t>
       </w:r>
       <m:oMath>
         <m:r>
-          <m:t>t</m:t>
+          <m:rPr>
+            <m:sty m:val="p"/>
+          </m:rPr>
+          <m:t>±</m:t>
         </m:r>
       </m:oMath>
       <w:r>
-        <w:t xml:space="preserve">-intervals over five seeds. McNemar with continuity correction </w:t>
+        <w:t xml:space="preserve"> </w:t>
+      </w:r>
+      <m:oMath>
+        <m:r>
+          <m:t>1.96</m:t>
+        </m:r>
+      </m:oMath>
+      <w:r>
+        <w:t xml:space="preserve"> </w:t>
+      </w:r>
+      <w:r>
+        <w:t xml:space="preserve">standard error over five seeds. McNemar with continuity correction </w:t>
       </w:r>
       <w:r>
         <w:t xml:space="preserve">(Dietterich 1998)</w:t>
@@ -5322,7 +5733,54 @@
         </m:sSub>
       </m:oMath>
       <w:r>
-        <w:t xml:space="preserve">. Both counts use templated token bags with filler padding. Table </w:t>
+        <w:t xml:space="preserve">.</w:t>
+      </w:r>
+      <w:r>
+        <w:t xml:space="preserve"> </w:t>
+      </w:r>
+      <m:oMath>
+        <m:sSub>
+          <m:e>
+            <m:r>
+              <m:rPr>
+                <m:sty m:val="p"/>
+              </m:rPr>
+              <m:t>I</m:t>
+            </m:r>
+            <m:r>
+              <m:rPr>
+                <m:sty m:val="p"/>
+              </m:rPr>
+              <m:t>N</m:t>
+            </m:r>
+          </m:e>
+          <m:sub>
+            <m:r>
+              <m:rPr>
+                <m:sty m:val="p"/>
+              </m:rPr>
+              <m:t>n</m:t>
+            </m:r>
+            <m:r>
+              <m:rPr>
+                <m:sty m:val="p"/>
+              </m:rPr>
+              <m:t>e</m:t>
+            </m:r>
+            <m:r>
+              <m:rPr>
+                <m:sty m:val="p"/>
+              </m:rPr>
+              <m:t>w</m:t>
+            </m:r>
+          </m:sub>
+        </m:sSub>
+      </m:oMath>
+      <w:r>
+        <w:t xml:space="preserve"> </w:t>
+      </w:r>
+      <w:r>
+        <w:t xml:space="preserve">is our index; Sun et al. motivate dividing by delivered length. Both counts use templated token bags with filler padding. Table </w:t>
       </w:r>
       <w:hyperlink w:anchor="tab:tiers">
         <w:r>
@@ -6539,8 +6997,16 @@
       <w:r>
         <w:t xml:space="preserve"> </w:t>
       </w:r>
-      <w:r>
-        <w:t xml:space="preserve">95% CI, five seeds. Rows are ordered by macro-F1. MiniLM, BGE-M3 and ViT are unimodal probes. Mixers: GMU </w:t>
+      <m:oMath>
+        <m:r>
+          <m:t>1.96</m:t>
+        </m:r>
+      </m:oMath>
+      <w:r>
+        <w:t xml:space="preserve"> </w:t>
+      </w:r>
+      <w:r>
+        <w:t xml:space="preserve">se, five seeds. Rows are ordered by macro-F1. MiniLM, BGE-M3 and ViT are unimodal probes. Mixers: GMU </w:t>
       </w:r>
       <w:r>
         <w:t xml:space="preserve">(Arevalo et al. 2017)</w:t>
@@ -6558,7 +7024,7 @@
         <w:t xml:space="preserve">(Tsai et al. 2019)</w:t>
       </w:r>
       <w:r>
-        <w:t xml:space="preserve">. The scalar gate row mixes class scores. Learned</w:t>
+        <w:t xml:space="preserve">. GMU/TFN/gate mix unimodal class scores; Arevalo’s</w:t>
       </w:r>
       <w:r>
         <w:t xml:space="preserve"> </w:t>
@@ -6572,7 +7038,43 @@
           </m:e>
           <m:sub>
             <m:r>
-              <m:t>g</m:t>
+              <m:t>v</m:t>
+            </m:r>
+          </m:sub>
+        </m:sSub>
+        <m:r>
+          <m:rPr>
+            <m:sty m:val="p"/>
+          </m:rPr>
+          <m:t>,</m:t>
+        </m:r>
+        <m:sSub>
+          <m:e>
+            <m:r>
+              <m:t>W</m:t>
+            </m:r>
+          </m:e>
+          <m:sub>
+            <m:r>
+              <m:t>t</m:t>
+            </m:r>
+          </m:sub>
+        </m:sSub>
+        <m:r>
+          <m:rPr>
+            <m:sty m:val="p"/>
+          </m:rPr>
+          <m:t>,</m:t>
+        </m:r>
+        <m:sSub>
+          <m:e>
+            <m:r>
+              <m:t>W</m:t>
+            </m:r>
+          </m:e>
+          <m:sub>
+            <m:r>
+              <m:t>z</m:t>
             </m:r>
           </m:sub>
         </m:sSub>
@@ -6581,35 +7083,7 @@
         <w:t xml:space="preserve"> </w:t>
       </w:r>
       <w:r>
-        <w:t xml:space="preserve">in Eqs. </w:t>
-      </w:r>
-      <w:hyperlink w:anchor="eq:gate">
-        <w:r>
-          <w:rPr>
-            <w:rStyle w:val="Hyperlink"/>
-          </w:rPr>
-          <w:t xml:space="preserve">[eq:gate]</w:t>
-        </w:r>
-      </w:hyperlink>
-      <w:r>
-        <w:t xml:space="preserve"> </w:t>
-      </w:r>
-      <w:r>
-        <w:t xml:space="preserve">and </w:t>
-      </w:r>
-      <w:hyperlink w:anchor="eq:fuse">
-        <w:r>
-          <w:rPr>
-            <w:rStyle w:val="Hyperlink"/>
-          </w:rPr>
-          <w:t xml:space="preserve">[eq:fuse]</w:t>
-        </w:r>
-      </w:hyperlink>
-      <w:r>
-        <w:t xml:space="preserve"> </w:t>
-      </w:r>
-      <w:r>
-        <w:t xml:space="preserve">is unused in the public tables.</w:t>
+        <w:t xml:space="preserve">are unused.</w:t>
       </w:r>
     </w:p>
     <w:tbl>
@@ -6618,7 +7092,7 @@
         <w:tblW w:type="auto" w:w="0"/>
         <w:tblLook w:firstRow="1" w:lastRow="0" w:firstColumn="0" w:lastColumn="0" w:noHBand="0" w:noVBand="0" w:val="0020"/>
         <w:jc w:val="start"/>
-        <w:tblCaption w:val="Next-day BIST100 direction on VESTA-Public (test n=308). Mean \pm 95% CI, five seeds. Rows are ordered by macro-F1. MiniLM, BGE-M3 and ViT are unimodal probes. Mixers: GMU (Arevalo et al. 2017), TFN (Zadeh et al. 2017), MulT-style (Tsai et al. 2019). The scalar gate row mixes class scores. Learned W_g in Eqs. [eq:gate] and [eq:fuse] is unused in the public tables."/>
+        <w:tblCaption w:val="Next-day BIST100 direction on VESTA-Public (test n=308). Mean \pm 1.96 se, five seeds. Rows are ordered by macro-F1. MiniLM, BGE-M3 and ViT are unimodal probes. Mixers: GMU (Arevalo et al. 2017), TFN (Zadeh et al. 2017), MulT-style (Tsai et al. 2019). GMU/TFN/gate mix unimodal class scores; Arevalo’s W_v,W_t,W_z are unused."/>
       </w:tblPr>
       <w:tblGrid>
         <w:gridCol w:w="2640"/>
@@ -9876,7 +10350,7 @@
         <w:t xml:space="preserve"> </w:t>
       </w:r>
       <w:r>
-        <w:t xml:space="preserve">mixers fuse unimodal scores;</w:t>
+        <w:t xml:space="preserve">mixers fuse unimodal class scores; Arevalo’s</w:t>
       </w:r>
       <w:r>
         <w:t xml:space="preserve"> </w:t>
@@ -9890,7 +10364,43 @@
           </m:e>
           <m:sub>
             <m:r>
-              <m:t>g</m:t>
+              <m:t>v</m:t>
+            </m:r>
+          </m:sub>
+        </m:sSub>
+        <m:r>
+          <m:rPr>
+            <m:sty m:val="p"/>
+          </m:rPr>
+          <m:t>,</m:t>
+        </m:r>
+        <m:sSub>
+          <m:e>
+            <m:r>
+              <m:t>W</m:t>
+            </m:r>
+          </m:e>
+          <m:sub>
+            <m:r>
+              <m:t>t</m:t>
+            </m:r>
+          </m:sub>
+        </m:sSub>
+        <m:r>
+          <m:rPr>
+            <m:sty m:val="p"/>
+          </m:rPr>
+          <m:t>,</m:t>
+        </m:r>
+        <m:sSub>
+          <m:e>
+            <m:r>
+              <m:t>W</m:t>
+            </m:r>
+          </m:e>
+          <m:sub>
+            <m:r>
+              <m:t>z</m:t>
             </m:r>
           </m:sub>
         </m:sSub>
@@ -9899,7 +10409,7 @@
         <w:t xml:space="preserve"> </w:t>
       </w:r>
       <w:r>
-        <w:t xml:space="preserve">is not trained.</w:t>
+        <w:t xml:space="preserve">are unused.</w:t>
       </w:r>
     </w:p>
     <w:bookmarkEnd w:id="68"/>
@@ -10161,7 +10671,7 @@
         <w:t xml:space="preserve"> </w:t>
       </w:r>
       <w:r>
-        <w:t xml:space="preserve">mixers fuse unimodal scores;</w:t>
+        <w:t xml:space="preserve">mixers fuse unimodal class scores; Arevalo’s</w:t>
       </w:r>
       <w:r>
         <w:t xml:space="preserve"> </w:t>
@@ -10175,7 +10685,43 @@
           </m:e>
           <m:sub>
             <m:r>
-              <m:t>g</m:t>
+              <m:t>v</m:t>
+            </m:r>
+          </m:sub>
+        </m:sSub>
+        <m:r>
+          <m:rPr>
+            <m:sty m:val="p"/>
+          </m:rPr>
+          <m:t>,</m:t>
+        </m:r>
+        <m:sSub>
+          <m:e>
+            <m:r>
+              <m:t>W</m:t>
+            </m:r>
+          </m:e>
+          <m:sub>
+            <m:r>
+              <m:t>t</m:t>
+            </m:r>
+          </m:sub>
+        </m:sSub>
+        <m:r>
+          <m:rPr>
+            <m:sty m:val="p"/>
+          </m:rPr>
+          <m:t>,</m:t>
+        </m:r>
+        <m:sSub>
+          <m:e>
+            <m:r>
+              <m:t>W</m:t>
+            </m:r>
+          </m:e>
+          <m:sub>
+            <m:r>
+              <m:t>z</m:t>
             </m:r>
           </m:sub>
         </m:sSub>
@@ -10184,7 +10730,7 @@
         <w:t xml:space="preserve"> </w:t>
       </w:r>
       <w:r>
-        <w:t xml:space="preserve">is unused. The public chart is bars</w:t>
+        <w:t xml:space="preserve">are unused. The public chart is bars</w:t>
       </w:r>
       <w:r>
         <w:t xml:space="preserve"> </w:t>

</xml_diff>